<commit_message>
Court of Appeals of Georgia on the shared document model: answering and reply briefs gated
answering-brief and reply-brief: layout.yaml, latex and docx generated (their hand-written docx
filters removed), XENG-001..003 pass on latex and docx under the court gate. amicus-brief: ported,
cover gaps tightened to keep the cover one page, cross_engine report (a URL slash breaks
differently). opening-brief, motion-brief and petition-for-rehearing keep their typst and docx
engines: on the model they would lose the docx gate they pass now (docs/open-items/fb-595.54.59.md).

Co-Authored-By: Claude Opus 5.5 <noreply@anthropic.com>
(fb-595.54.59)
</commit_message>
<xml_diff>
--- a/courts/eleventh-circuit/georgia/state/court-of-appeals/answering-brief/usage/OUTPUT-answering-brief.docx
+++ b/courts/eleventh-circuit/georgia/state/court-of-appeals/answering-brief/usage/OUTPUT-answering-brief.docx
@@ -438,6 +438,7 @@
       <w:pPr>
         <w:spacing w:before="1440" w:after="0" w:line="322" w:lineRule="exact"/>
         <w:ind w:left="4608" w:firstLine="0"/>
+        <w:jc w:val="left"/>
       </w:pPr>
       <w:r>
         <w:rPr>
@@ -465,6 +466,7 @@
       <w:pPr>
         <w:spacing w:before="0" w:after="0" w:line="322" w:lineRule="exact"/>
         <w:ind w:left="4608" w:firstLine="0"/>
+        <w:jc w:val="left"/>
       </w:pPr>
       <w:r>
         <w:rPr>
@@ -506,6 +508,7 @@
       <w:pPr>
         <w:spacing w:before="0" w:after="0" w:line="322" w:lineRule="exact"/>
         <w:ind w:left="4608" w:firstLine="0"/>
+        <w:jc w:val="left"/>
       </w:pPr>
       <w:r>
         <w:rPr>
@@ -533,6 +536,7 @@
       <w:pPr>
         <w:spacing w:before="0" w:after="0" w:line="322" w:lineRule="exact"/>
         <w:ind w:left="4608" w:firstLine="0"/>
+        <w:jc w:val="left"/>
       </w:pPr>
       <w:r>
         <w:t xml:space="preserve">HALL</w:t>
@@ -560,6 +564,7 @@
       <w:pPr>
         <w:spacing w:before="0" w:after="0" w:line="322" w:lineRule="exact"/>
         <w:ind w:left="4608" w:firstLine="0"/>
+        <w:jc w:val="left"/>
       </w:pPr>
       <w:r>
         <w:t xml:space="preserve">191</w:t>
@@ -587,6 +592,7 @@
       <w:pPr>
         <w:spacing w:before="0" w:after="0" w:line="322" w:lineRule="exact"/>
         <w:ind w:left="4608" w:firstLine="0"/>
+        <w:jc w:val="left"/>
       </w:pPr>
       <w:r>
         <w:t xml:space="preserve">Suite</w:t>
@@ -602,6 +608,7 @@
       <w:pPr>
         <w:spacing w:before="0" w:after="0" w:line="322" w:lineRule="exact"/>
         <w:ind w:left="4608" w:firstLine="0"/>
+        <w:jc w:val="left"/>
       </w:pPr>
       <w:r>
         <w:t xml:space="preserve">Atlanta,</w:t>
@@ -623,20 +630,13 @@
       <w:pPr>
         <w:spacing w:before="0" w:after="0" w:line="322" w:lineRule="exact"/>
         <w:ind w:left="4608" w:firstLine="0"/>
+        <w:jc w:val="left"/>
       </w:pPr>
       <w:r>
         <w:t xml:space="preserve">404</w:t>
-      </w:r>
-      <w:r>
         <w:noBreakHyphen/>
-      </w:r>
-      <w:r>
         <w:t xml:space="preserve">954</w:t>
-      </w:r>
-      <w:r>
         <w:noBreakHyphen/>
-      </w:r>
-      <w:r>
         <w:t xml:space="preserve">5000</w:t>
       </w:r>
     </w:p>
@@ -644,6 +644,7 @@
       <w:pPr>
         <w:spacing w:before="0" w:after="0" w:line="322" w:lineRule="exact"/>
         <w:ind w:left="4608" w:firstLine="0"/>
+        <w:jc w:val="left"/>
       </w:pPr>
       <w:r>
         <w:t xml:space="preserve">aatkinson@hallboothsmith.com</w:t>
@@ -653,6 +654,7 @@
       <w:pPr>
         <w:spacing w:before="0" w:after="0" w:line="322" w:lineRule="exact"/>
         <w:ind w:left="4608" w:firstLine="0"/>
+        <w:jc w:val="left"/>
       </w:pPr>
       <w:r>
         <w:t xml:space="preserve">bwalker@hallboothsmith.com</w:t>
@@ -662,6 +664,7 @@
       <w:pPr>
         <w:spacing w:before="0" w:after="0" w:line="322" w:lineRule="exact"/>
         <w:ind w:left="4608" w:firstLine="0"/>
+        <w:jc w:val="left"/>
       </w:pPr>
       <w:r>
         <w:t xml:space="preserve">mmcclure@hallboothsmith.com</w:t>
@@ -671,6 +674,7 @@
       <w:pPr>
         <w:spacing w:before="0" w:after="0" w:line="322" w:lineRule="exact"/>
         <w:ind w:left="4608" w:firstLine="0"/>
+        <w:jc w:val="left"/>
       </w:pPr>
       <w:r>
         <w:rPr>
@@ -711,7 +715,14 @@
     <w:p>
       <w:pPr>
         <w:pageBreakBefore/>
-        <w:spacing w:before="0" w:after="322" w:line="322" w:lineRule="exact"/>
+        <w:spacing w:before="0" w:after="0" w:line="1" w:lineRule="exact"/>
+      </w:pPr>
+    </w:p>
+    <w:p>
+      <w:pPr>
+        <w:keepNext/>
+        <w:keepLines/>
+        <w:spacing w:before="0" w:after="320" w:line="322" w:lineRule="exact"/>
         <w:ind w:left="0" w:firstLine="0"/>
         <w:jc w:val="center"/>
       </w:pPr>
@@ -1049,43 +1060,14 @@
     </w:p>
     <w:p>
       <w:pPr>
-        <w:keepLines/>
-        <w:tabs>
-          <w:tab w:val="right" w:leader="dot" w:pos="9360"/>
-        </w:tabs>
-        <w:spacing w:before="160" w:after="0" w:line="322" w:lineRule="exact"/>
-        <w:ind w:left="720" w:right="720" w:hanging="720"/>
-      </w:pPr>
-      <w:r>
-        <w:t xml:space="preserve">Certificate</w:t>
-      </w:r>
-      <w:r>
-        <w:t xml:space="preserve"> </w:t>
-      </w:r>
-      <w:r>
-        <w:t xml:space="preserve">of</w:t>
-      </w:r>
-      <w:r>
-        <w:t xml:space="preserve"> </w:t>
-      </w:r>
-      <w:r>
-        <w:t xml:space="preserve">Service</w:t>
-      </w:r>
-      <w:r>
-        <w:t xml:space="preserve">   </w:t>
-      </w:r>
-      <w:r>
-        <w:tab/>
-      </w:r>
-      <w:r>
-        <w:t xml:space="preserve">10</w:t>
-      </w:r>
+        <w:pageBreakBefore/>
+        <w:spacing w:before="0" w:after="0" w:line="1" w:lineRule="exact"/>
+      </w:pPr>
     </w:p>
     <w:p>
       <w:pPr>
         <w:keepNext/>
         <w:keepLines/>
-        <w:pageBreakBefore/>
         <w:spacing w:before="0" w:after="320" w:line="322" w:lineRule="exact"/>
         <w:ind w:left="0" w:firstLine="0"/>
         <w:jc w:val="center"/>
@@ -1142,7 +1124,7 @@
     </w:p>
     <w:p>
       <w:pPr>
-        <w:pStyle w:val="FirstParagraph"/>
+        <w:pStyle w:val="BodyText"/>
       </w:pPr>
       <w:r>
         <w:t xml:space="preserve">Plaintiff-Appellant Doris Campbell received a horrifying phone call from her mother, Carolyn Goslin, on July 9, 2017. Ms. Goslin was being attacked by her boyfriend, Clinton Taylor. V2</w:t>
@@ -1202,7 +1184,7 @@
     </w:p>
     <w:p>
       <w:pPr>
-        <w:pStyle w:val="BodyText"/>
+        <w:pStyle w:val="BodyTextNote"/>
       </w:pPr>
       <w:r>
         <w:t xml:space="preserve">Appellant later sued Mr. Taylor and his mother, Susan Taylor.</w:t>
@@ -1280,6 +1262,7 @@
         <w:keepLines/>
         <w:spacing w:before="320" w:after="240" w:line="322" w:lineRule="exact"/>
         <w:ind w:left="720" w:hanging="720"/>
+        <w:jc w:val="left"/>
       </w:pPr>
       <w:r>
         <w:rPr>
@@ -1543,12 +1526,12 @@
         <w:noBreakHyphen/>
       </w:r>
       <w:r>
-        <w:t xml:space="preserve">103–104; Appellant Br. at 14 (“[Appellant] was faced with an emergent need to protect her blind mother . . . .”).</w:t>
-      </w:r>
-    </w:p>
-    <w:p>
-      <w:pPr>
-        <w:pStyle w:val="BodyText"/>
+        <w:t xml:space="preserve">103–104; Appellant Br. at 14 (“[Appellant] was faced with an emergent need to protect her blind mother . . . .”).</w:t>
+      </w:r>
+    </w:p>
+    <w:p>
+      <w:pPr>
+        <w:pStyle w:val="BodyTextNote"/>
       </w:pPr>
       <w:r>
         <w:t xml:space="preserve">Appellant, to be sure, does not appear to disagree with this view. She instead claims the trial court erred because she never consented to Mr. Taylor attacking her.</w:t>
@@ -1563,7 +1546,7 @@
         <w:t xml:space="preserve"> </w:t>
       </w:r>
       <w:r>
-        <w:t xml:space="preserve">Appellant Br. at 13–14 (“Appellant did not consent to getting into an altercation with Mr. Taylor . . . .”). Appellant insists, for example, that she did not “[know] she would be violently attacked by Mr. Taylor. Appellant Br. at 12. And she says she did not intend to “engage with” Mr. Taylor while at Ms. Taylor’s home. Appellant Br. at 12. But consent to injury is not an element of the assumption-of-the-risk defense, and Appellant’s contrary view misconstrues the law.</w:t>
+        <w:t xml:space="preserve">Appellant Br. at 13–14 (“Appellant did not consent to getting into an altercation with Mr. Taylor . . . .”). Appellant insists, for example, that she did not “[know] she would be violently attacked by Mr. Taylor. Appellant Br. at 12. And she says she did not intend to “engage with” Mr. Taylor while at Ms. Taylor’s home. Appellant Br. at 12. But consent to injury is not an element of the assumption-of-the-risk defense, and Appellant’s contrary view misconstrues the law.</w:t>
       </w:r>
     </w:p>
     <w:p>
@@ -1724,6 +1707,7 @@
         <w:keepLines/>
         <w:spacing w:before="320" w:after="240" w:line="322" w:lineRule="exact"/>
         <w:ind w:left="720" w:hanging="720"/>
+        <w:jc w:val="left"/>
       </w:pPr>
       <w:r>
         <w:rPr>
@@ -2088,7 +2072,7 @@
     </w:p>
     <w:p>
       <w:pPr>
-        <w:pStyle w:val="BlockText"/>
+        <w:pStyle w:val="XdQuoteFirst"/>
       </w:pPr>
       <w:r>
         <w:t xml:space="preserve">[QUESTION]: At the time of the accident, did you know that Mr. Taylor was violent?</w:t>
@@ -2096,7 +2080,7 @@
     </w:p>
     <w:p>
       <w:pPr>
-        <w:pStyle w:val="BlockText"/>
+        <w:pStyle w:val="XdQuoteLast"/>
       </w:pPr>
       <w:r>
         <w:t xml:space="preserve">[APPELLANT]: Yes.</w:t>
@@ -2104,7 +2088,7 @@
     </w:p>
     <w:p>
       <w:pPr>
-        <w:pStyle w:val="FirstParagraph"/>
+        <w:pStyle w:val="BodyText"/>
       </w:pPr>
       <w:r>
         <w:t xml:space="preserve">V2</w:t>
@@ -2228,491 +2212,497 @@
         <w:t xml:space="preserve">This Court should affirm the trial court’s grant of summary judgment to Appellee.</w:t>
       </w:r>
     </w:p>
-    <w:p>
-      <w:pPr>
-        <w:keepNext/>
-        <w:keepLines/>
-        <w:spacing w:before="0" w:after="0" w:line="644" w:lineRule="exact"/>
-        <w:ind w:left="0" w:firstLine="720"/>
-      </w:pPr>
-      <w:r>
-        <w:t xml:space="preserve">This</w:t>
-      </w:r>
-      <w:r>
-        <w:t xml:space="preserve"> </w:t>
-      </w:r>
-      <w:r>
-        <w:t xml:space="preserve">submission</w:t>
-      </w:r>
-      <w:r>
-        <w:t xml:space="preserve"> </w:t>
-      </w:r>
-      <w:r>
-        <w:t xml:space="preserve">does</w:t>
-      </w:r>
-      <w:r>
-        <w:t xml:space="preserve"> </w:t>
-      </w:r>
-      <w:r>
-        <w:t xml:space="preserve">not</w:t>
-      </w:r>
-      <w:r>
-        <w:t xml:space="preserve"> </w:t>
-      </w:r>
-      <w:r>
-        <w:t xml:space="preserve">exceed</w:t>
-      </w:r>
-      <w:r>
-        <w:t xml:space="preserve"> </w:t>
-      </w:r>
-      <w:r>
-        <w:t xml:space="preserve">the</w:t>
-      </w:r>
-      <w:r>
-        <w:t xml:space="preserve"> </w:t>
-      </w:r>
-      <w:r>
-        <w:t xml:space="preserve">word</w:t>
-      </w:r>
-      <w:r>
-        <w:t xml:space="preserve"> </w:t>
-      </w:r>
-      <w:r>
-        <w:t xml:space="preserve">count</w:t>
-      </w:r>
-      <w:r>
-        <w:t xml:space="preserve"> </w:t>
-      </w:r>
-      <w:r>
-        <w:t xml:space="preserve">limit</w:t>
-      </w:r>
-      <w:r>
-        <w:t xml:space="preserve"> </w:t>
-      </w:r>
-      <w:r>
-        <w:t xml:space="preserve">imposed</w:t>
-      </w:r>
-      <w:r>
-        <w:t xml:space="preserve"> </w:t>
-      </w:r>
-      <w:r>
-        <w:t xml:space="preserve">by</w:t>
-      </w:r>
-      <w:r>
-        <w:t xml:space="preserve"> </w:t>
-      </w:r>
-      <w:r>
-        <w:t xml:space="preserve">Rule</w:t>
-      </w:r>
-      <w:r>
-        <w:t xml:space="preserve"> </w:t>
-      </w:r>
-      <w:r>
-        <w:t xml:space="preserve">24.</w:t>
-      </w:r>
-    </w:p>
-    <w:p>
-      <w:pPr>
-        <w:keepNext/>
-        <w:keepLines/>
-        <w:spacing w:before="0" w:after="0" w:line="644" w:lineRule="exact"/>
-        <w:ind w:left="0" w:firstLine="720"/>
-      </w:pPr>
-      <w:r>
-        <w:t xml:space="preserve">Respectfully</w:t>
-      </w:r>
-      <w:r>
-        <w:t xml:space="preserve"> </w:t>
-      </w:r>
-      <w:r>
-        <w:t xml:space="preserve">submitted</w:t>
-      </w:r>
-      <w:r>
-        <w:t xml:space="preserve"> </w:t>
-      </w:r>
-      <w:r>
-        <w:t xml:space="preserve">on</w:t>
-      </w:r>
-      <w:r>
-        <w:t xml:space="preserve"> </w:t>
-      </w:r>
-      <w:r>
-        <w:t xml:space="preserve">March</w:t>
-      </w:r>
-      <w:r>
-        <w:t xml:space="preserve"> </w:t>
-      </w:r>
-      <w:r>
-        <w:t xml:space="preserve">11,</w:t>
-      </w:r>
-      <w:r>
-        <w:t xml:space="preserve"> </w:t>
-      </w:r>
-      <w:r>
-        <w:t xml:space="preserve">2026.</w:t>
-      </w:r>
-    </w:p>
-    <w:p>
-      <w:pPr>
-        <w:keepNext/>
-        <w:keepLines/>
-        <w:spacing w:before="160" w:after="0" w:line="322" w:lineRule="exact"/>
-        <w:ind w:left="4608" w:firstLine="0"/>
-      </w:pPr>
-      <w:r>
-        <w:rPr>
-          <w:u w:val="single"/>
-        </w:rPr>
-        <w:t xml:space="preserve">/s/</w:t>
-      </w:r>
-      <w:r>
-        <w:rPr>
-          <w:u w:val="single"/>
-        </w:rPr>
-        <w:t xml:space="preserve"> </w:t>
-      </w:r>
-      <w:r>
-        <w:rPr>
-          <w:i/>
-          <w:iCs/>
-          <w:u w:val="single"/>
-        </w:rPr>
-        <w:t xml:space="preserve">Austin</w:t>
-      </w:r>
-      <w:r>
-        <w:rPr>
-          <w:i/>
-          <w:iCs/>
-          <w:u w:val="single"/>
-        </w:rPr>
-        <w:t xml:space="preserve"> </w:t>
-      </w:r>
-      <w:r>
-        <w:rPr>
-          <w:i/>
-          <w:iCs/>
-          <w:u w:val="single"/>
-        </w:rPr>
-        <w:t xml:space="preserve">Atkinson</w:t>
-      </w:r>
-    </w:p>
-    <w:p>
-      <w:pPr>
-        <w:keepNext/>
-        <w:keepLines/>
-        <w:spacing w:before="0" w:after="0" w:line="322" w:lineRule="exact"/>
-        <w:ind w:left="4608" w:firstLine="0"/>
-      </w:pPr>
-      <w:r>
-        <w:t xml:space="preserve">Austin</w:t>
-      </w:r>
-      <w:r>
-        <w:t xml:space="preserve"> </w:t>
-      </w:r>
-      <w:r>
-        <w:t xml:space="preserve">Atkinson</w:t>
-      </w:r>
-    </w:p>
-    <w:p>
-      <w:pPr>
-        <w:keepNext/>
-        <w:keepLines/>
-        <w:spacing w:before="0" w:after="0" w:line="322" w:lineRule="exact"/>
-        <w:ind w:left="4608" w:firstLine="0"/>
-      </w:pPr>
-      <w:r>
-        <w:t xml:space="preserve">Georgia</w:t>
-      </w:r>
-      <w:r>
-        <w:t xml:space="preserve"> </w:t>
-      </w:r>
-      <w:r>
-        <w:t xml:space="preserve">Bar</w:t>
-      </w:r>
-      <w:r>
-        <w:t xml:space="preserve"> </w:t>
-      </w:r>
-      <w:r>
-        <w:t xml:space="preserve">No.</w:t>
-      </w:r>
-      <w:r>
-        <w:t xml:space="preserve"> </w:t>
-      </w:r>
-      <w:r>
-        <w:t xml:space="preserve">935864</w:t>
-      </w:r>
-    </w:p>
-    <w:p>
-      <w:pPr>
-        <w:keepNext/>
-        <w:keepLines/>
-        <w:spacing w:before="160" w:after="0" w:line="322" w:lineRule="exact"/>
-        <w:ind w:left="4608" w:firstLine="0"/>
-      </w:pPr>
-      <w:r>
-        <w:t xml:space="preserve">M.</w:t>
-      </w:r>
-      <w:r>
-        <w:t xml:space="preserve"> </w:t>
-      </w:r>
-      <w:r>
-        <w:t xml:space="preserve">Blake</w:t>
-      </w:r>
-      <w:r>
-        <w:t xml:space="preserve"> </w:t>
-      </w:r>
-      <w:r>
-        <w:t xml:space="preserve">Walker</w:t>
-      </w:r>
-    </w:p>
-    <w:p>
-      <w:pPr>
-        <w:keepNext/>
-        <w:keepLines/>
-        <w:spacing w:before="0" w:after="0" w:line="322" w:lineRule="exact"/>
-        <w:ind w:left="4608" w:firstLine="0"/>
-      </w:pPr>
-      <w:r>
-        <w:t xml:space="preserve">Georgia</w:t>
-      </w:r>
-      <w:r>
-        <w:t xml:space="preserve"> </w:t>
-      </w:r>
-      <w:r>
-        <w:t xml:space="preserve">Bar</w:t>
-      </w:r>
-      <w:r>
-        <w:t xml:space="preserve"> </w:t>
-      </w:r>
-      <w:r>
-        <w:t xml:space="preserve">No.</w:t>
-      </w:r>
-      <w:r>
-        <w:t xml:space="preserve"> </w:t>
-      </w:r>
-      <w:r>
-        <w:t xml:space="preserve">993236</w:t>
-      </w:r>
-    </w:p>
-    <w:p>
-      <w:pPr>
-        <w:keepNext/>
-        <w:keepLines/>
-        <w:spacing w:before="0" w:after="0" w:line="322" w:lineRule="exact"/>
-        <w:ind w:left="4608" w:firstLine="0"/>
-      </w:pPr>
-      <w:r>
-        <w:t xml:space="preserve">Morgan</w:t>
-      </w:r>
-      <w:r>
-        <w:t xml:space="preserve"> </w:t>
-      </w:r>
-      <w:r>
-        <w:t xml:space="preserve">McClure</w:t>
-      </w:r>
-    </w:p>
-    <w:p>
-      <w:pPr>
-        <w:keepNext/>
-        <w:keepLines/>
-        <w:spacing w:before="0" w:after="0" w:line="322" w:lineRule="exact"/>
-        <w:ind w:left="4608" w:firstLine="0"/>
-      </w:pPr>
-      <w:r>
-        <w:t xml:space="preserve">Georgia</w:t>
-      </w:r>
-      <w:r>
-        <w:t xml:space="preserve"> </w:t>
-      </w:r>
-      <w:r>
-        <w:t xml:space="preserve">Bar</w:t>
-      </w:r>
-      <w:r>
-        <w:t xml:space="preserve"> </w:t>
-      </w:r>
-      <w:r>
-        <w:t xml:space="preserve">No.</w:t>
-      </w:r>
-      <w:r>
-        <w:t xml:space="preserve"> </w:t>
-      </w:r>
-      <w:r>
-        <w:t xml:space="preserve">884372</w:t>
-      </w:r>
-    </w:p>
-    <w:p>
-      <w:pPr>
-        <w:keepNext/>
-        <w:keepLines/>
-        <w:spacing w:before="0" w:after="0" w:line="322" w:lineRule="exact"/>
-        <w:ind w:left="4608" w:firstLine="0"/>
-      </w:pPr>
-      <w:r>
-        <w:t xml:space="preserve">HALL</w:t>
-      </w:r>
-      <w:r>
-        <w:t xml:space="preserve"> </w:t>
-      </w:r>
-      <w:r>
-        <w:t xml:space="preserve">BOOTH</w:t>
-      </w:r>
-      <w:r>
-        <w:t xml:space="preserve"> </w:t>
-      </w:r>
-      <w:r>
-        <w:t xml:space="preserve">SMITH,</w:t>
-      </w:r>
-      <w:r>
-        <w:t xml:space="preserve"> </w:t>
-      </w:r>
-      <w:r>
-        <w:t xml:space="preserve">P.C.</w:t>
-      </w:r>
-    </w:p>
-    <w:p>
-      <w:pPr>
-        <w:keepNext/>
-        <w:keepLines/>
-        <w:spacing w:before="0" w:after="0" w:line="322" w:lineRule="exact"/>
-        <w:ind w:left="4608" w:firstLine="0"/>
-      </w:pPr>
-      <w:r>
-        <w:t xml:space="preserve">191</w:t>
-      </w:r>
-      <w:r>
-        <w:t xml:space="preserve"> </w:t>
-      </w:r>
-      <w:r>
-        <w:t xml:space="preserve">Peachtree</w:t>
-      </w:r>
-      <w:r>
-        <w:t xml:space="preserve"> </w:t>
-      </w:r>
-      <w:r>
-        <w:t xml:space="preserve">St.</w:t>
-      </w:r>
-      <w:r>
-        <w:t xml:space="preserve"> </w:t>
-      </w:r>
-      <w:r>
-        <w:t xml:space="preserve">NE,</w:t>
-      </w:r>
-      <w:r>
-        <w:t xml:space="preserve"> </w:t>
-      </w:r>
-      <w:r>
-        <w:t xml:space="preserve">Suite</w:t>
-      </w:r>
-      <w:r>
-        <w:t xml:space="preserve"> </w:t>
-      </w:r>
-      <w:r>
-        <w:t xml:space="preserve">2900</w:t>
-      </w:r>
-    </w:p>
-    <w:p>
-      <w:pPr>
-        <w:keepNext/>
-        <w:keepLines/>
-        <w:spacing w:before="0" w:after="0" w:line="322" w:lineRule="exact"/>
-        <w:ind w:left="4608" w:firstLine="0"/>
-      </w:pPr>
-      <w:r>
-        <w:t xml:space="preserve">404</w:t>
-      </w:r>
-      <w:r>
-        <w:noBreakHyphen/>
-      </w:r>
-      <w:r>
-        <w:t xml:space="preserve">954</w:t>
-      </w:r>
-      <w:r>
-        <w:noBreakHyphen/>
-      </w:r>
-      <w:r>
-        <w:t xml:space="preserve">5000</w:t>
-      </w:r>
-    </w:p>
-    <w:p>
-      <w:pPr>
-        <w:keepNext/>
-        <w:keepLines/>
-        <w:spacing w:before="0" w:after="0" w:line="322" w:lineRule="exact"/>
-        <w:ind w:left="4608" w:firstLine="0"/>
-      </w:pPr>
-      <w:r>
-        <w:t xml:space="preserve">aatkinson@hallboothsmith.com</w:t>
-      </w:r>
-    </w:p>
-    <w:p>
-      <w:pPr>
-        <w:keepNext/>
-        <w:keepLines/>
-        <w:spacing w:before="0" w:after="0" w:line="322" w:lineRule="exact"/>
-        <w:ind w:left="4608" w:firstLine="0"/>
-      </w:pPr>
-      <w:r>
-        <w:t xml:space="preserve">bwalker@hallboothsmith.com</w:t>
-      </w:r>
-    </w:p>
-    <w:p>
-      <w:pPr>
-        <w:keepNext/>
-        <w:keepLines/>
-        <w:spacing w:before="0" w:after="0" w:line="322" w:lineRule="exact"/>
-        <w:ind w:left="4608" w:firstLine="0"/>
-      </w:pPr>
-      <w:r>
-        <w:t xml:space="preserve">mmcclure@hallboothsmith.com</w:t>
-      </w:r>
-    </w:p>
-    <w:p>
-      <w:pPr>
-        <w:keepLines/>
-        <w:spacing w:before="0" w:after="0" w:line="322" w:lineRule="exact"/>
-        <w:ind w:left="4608" w:firstLine="0"/>
-      </w:pPr>
-      <w:r>
-        <w:rPr>
-          <w:i/>
-          <w:iCs/>
-        </w:rPr>
-        <w:t xml:space="preserve">Counsel</w:t>
-      </w:r>
-      <w:r>
-        <w:rPr>
-          <w:i/>
-          <w:iCs/>
-        </w:rPr>
-        <w:t xml:space="preserve"> </w:t>
-      </w:r>
-      <w:r>
-        <w:rPr>
-          <w:i/>
-          <w:iCs/>
-        </w:rPr>
-        <w:t xml:space="preserve">for</w:t>
-      </w:r>
-      <w:r>
-        <w:rPr>
-          <w:i/>
-          <w:iCs/>
-        </w:rPr>
-        <w:t xml:space="preserve"> </w:t>
-      </w:r>
-      <w:r>
-        <w:rPr>
-          <w:i/>
-          <w:iCs/>
-        </w:rPr>
-        <w:t xml:space="preserve">Appellee</w:t>
-      </w:r>
-    </w:p>
-    <w:p>
-      <w:pPr>
-        <w:keepNext/>
-        <w:keepLines/>
+    <w:tbl>
+      <w:tblPr>
+        <w:tblW w:w="9360" w:type="dxa"/>
+        <w:tblLayout w:type="fixed"/>
+        <w:tblCellMar>
+          <w:top w:w="0" w:type="dxa"/>
+          <w:left w:w="0" w:type="dxa"/>
+          <w:bottom w:w="0" w:type="dxa"/>
+          <w:right w:w="0" w:type="dxa"/>
+        </w:tblCellMar>
+        <w:tblLook w:val="0000" w:firstRow="0" w:lastRow="0" w:firstColumn="0" w:lastColumn="0" w:noHBand="0" w:noVBand="0"/>
+      </w:tblPr>
+      <w:tblGrid>
+        <w:gridCol w:w="9360"/>
+      </w:tblGrid>
+      <w:tr>
+        <w:trPr>
+          <w:cantSplit/>
+        </w:trPr>
+        <w:tc>
+          <w:tcPr>
+            <w:tcW w:w="9360" w:type="dxa"/>
+          </w:tcPr>
+          <w:p>
+            <w:pPr>
+              <w:spacing w:before="0" w:after="0" w:line="644" w:lineRule="exact"/>
+              <w:ind w:left="0" w:firstLine="720"/>
+              <w:jc w:val="left"/>
+            </w:pPr>
+            <w:r>
+              <w:t xml:space="preserve">This</w:t>
+            </w:r>
+            <w:r>
+              <w:t xml:space="preserve"> </w:t>
+            </w:r>
+            <w:r>
+              <w:t xml:space="preserve">submission</w:t>
+            </w:r>
+            <w:r>
+              <w:t xml:space="preserve"> </w:t>
+            </w:r>
+            <w:r>
+              <w:t xml:space="preserve">does</w:t>
+            </w:r>
+            <w:r>
+              <w:t xml:space="preserve"> </w:t>
+            </w:r>
+            <w:r>
+              <w:t xml:space="preserve">not</w:t>
+            </w:r>
+            <w:r>
+              <w:t xml:space="preserve"> </w:t>
+            </w:r>
+            <w:r>
+              <w:t xml:space="preserve">exceed</w:t>
+            </w:r>
+            <w:r>
+              <w:t xml:space="preserve"> </w:t>
+            </w:r>
+            <w:r>
+              <w:t xml:space="preserve">the</w:t>
+            </w:r>
+            <w:r>
+              <w:t xml:space="preserve"> </w:t>
+            </w:r>
+            <w:r>
+              <w:t xml:space="preserve">word</w:t>
+            </w:r>
+            <w:r>
+              <w:t xml:space="preserve"> </w:t>
+            </w:r>
+            <w:r>
+              <w:t xml:space="preserve">count</w:t>
+            </w:r>
+            <w:r>
+              <w:t xml:space="preserve"> </w:t>
+            </w:r>
+            <w:r>
+              <w:t xml:space="preserve">limit</w:t>
+            </w:r>
+            <w:r>
+              <w:t xml:space="preserve"> </w:t>
+            </w:r>
+            <w:r>
+              <w:t xml:space="preserve">imposed</w:t>
+            </w:r>
+            <w:r>
+              <w:t xml:space="preserve"> </w:t>
+            </w:r>
+            <w:r>
+              <w:t xml:space="preserve">by</w:t>
+            </w:r>
+            <w:r>
+              <w:t xml:space="preserve"> </w:t>
+            </w:r>
+            <w:r>
+              <w:t xml:space="preserve">Rule</w:t>
+            </w:r>
+            <w:r>
+              <w:t xml:space="preserve"> </w:t>
+            </w:r>
+            <w:r>
+              <w:t xml:space="preserve">24.</w:t>
+            </w:r>
+          </w:p>
+          <w:p>
+            <w:pPr>
+              <w:spacing w:before="0" w:after="0" w:line="644" w:lineRule="exact"/>
+              <w:ind w:left="0" w:firstLine="720"/>
+              <w:jc w:val="left"/>
+            </w:pPr>
+            <w:r>
+              <w:t xml:space="preserve">Respectfully</w:t>
+            </w:r>
+            <w:r>
+              <w:t xml:space="preserve"> </w:t>
+            </w:r>
+            <w:r>
+              <w:t xml:space="preserve">submitted</w:t>
+            </w:r>
+            <w:r>
+              <w:t xml:space="preserve"> </w:t>
+            </w:r>
+            <w:r>
+              <w:t xml:space="preserve">on</w:t>
+            </w:r>
+            <w:r>
+              <w:t xml:space="preserve"> </w:t>
+            </w:r>
+            <w:r>
+              <w:t xml:space="preserve">March</w:t>
+            </w:r>
+            <w:r>
+              <w:t xml:space="preserve"> </w:t>
+            </w:r>
+            <w:r>
+              <w:t xml:space="preserve">11,</w:t>
+            </w:r>
+            <w:r>
+              <w:t xml:space="preserve"> </w:t>
+            </w:r>
+            <w:r>
+              <w:t xml:space="preserve">2026.</w:t>
+            </w:r>
+          </w:p>
+          <w:p>
+            <w:pPr>
+              <w:spacing w:before="240" w:after="0" w:line="322" w:lineRule="exact"/>
+              <w:ind w:left="4608" w:firstLine="0"/>
+              <w:jc w:val="left"/>
+            </w:pPr>
+            <w:r>
+              <w:rPr>
+                <w:u w:val="single"/>
+              </w:rPr>
+              <w:t xml:space="preserve">/s/</w:t>
+            </w:r>
+            <w:r>
+              <w:rPr>
+                <w:u w:val="single"/>
+              </w:rPr>
+              <w:t xml:space="preserve"> </w:t>
+            </w:r>
+            <w:r>
+              <w:rPr>
+                <w:i/>
+                <w:iCs/>
+                <w:u w:val="single"/>
+              </w:rPr>
+              <w:t xml:space="preserve">Austin</w:t>
+            </w:r>
+            <w:r>
+              <w:rPr>
+                <w:i/>
+                <w:iCs/>
+                <w:u w:val="single"/>
+              </w:rPr>
+              <w:t xml:space="preserve"> </w:t>
+            </w:r>
+            <w:r>
+              <w:rPr>
+                <w:i/>
+                <w:iCs/>
+                <w:u w:val="single"/>
+              </w:rPr>
+              <w:t xml:space="preserve">Atkinson</w:t>
+            </w:r>
+          </w:p>
+          <w:p>
+            <w:pPr>
+              <w:spacing w:before="0" w:after="0" w:line="322" w:lineRule="exact"/>
+              <w:ind w:left="4608" w:firstLine="0"/>
+              <w:jc w:val="left"/>
+            </w:pPr>
+            <w:r>
+              <w:t xml:space="preserve">Austin</w:t>
+            </w:r>
+            <w:r>
+              <w:t xml:space="preserve"> </w:t>
+            </w:r>
+            <w:r>
+              <w:t xml:space="preserve">Atkinson</w:t>
+            </w:r>
+          </w:p>
+          <w:p>
+            <w:pPr>
+              <w:spacing w:before="0" w:after="0" w:line="322" w:lineRule="exact"/>
+              <w:ind w:left="4608" w:firstLine="0"/>
+              <w:jc w:val="left"/>
+            </w:pPr>
+            <w:r>
+              <w:t xml:space="preserve">Georgia</w:t>
+            </w:r>
+            <w:r>
+              <w:t xml:space="preserve"> </w:t>
+            </w:r>
+            <w:r>
+              <w:t xml:space="preserve">Bar</w:t>
+            </w:r>
+            <w:r>
+              <w:t xml:space="preserve"> </w:t>
+            </w:r>
+            <w:r>
+              <w:t xml:space="preserve">No.</w:t>
+            </w:r>
+            <w:r>
+              <w:t xml:space="preserve"> </w:t>
+            </w:r>
+            <w:r>
+              <w:t xml:space="preserve">935864</w:t>
+            </w:r>
+          </w:p>
+          <w:p>
+            <w:pPr>
+              <w:spacing w:before="160" w:after="0" w:line="322" w:lineRule="exact"/>
+              <w:ind w:left="4608" w:firstLine="0"/>
+              <w:jc w:val="left"/>
+            </w:pPr>
+            <w:r>
+              <w:t xml:space="preserve">M.</w:t>
+            </w:r>
+            <w:r>
+              <w:t xml:space="preserve"> </w:t>
+            </w:r>
+            <w:r>
+              <w:t xml:space="preserve">Blake</w:t>
+            </w:r>
+            <w:r>
+              <w:t xml:space="preserve"> </w:t>
+            </w:r>
+            <w:r>
+              <w:t xml:space="preserve">Walker</w:t>
+            </w:r>
+          </w:p>
+          <w:p>
+            <w:pPr>
+              <w:spacing w:before="0" w:after="0" w:line="322" w:lineRule="exact"/>
+              <w:ind w:left="4608" w:firstLine="0"/>
+              <w:jc w:val="left"/>
+            </w:pPr>
+            <w:r>
+              <w:t xml:space="preserve">Georgia</w:t>
+            </w:r>
+            <w:r>
+              <w:t xml:space="preserve"> </w:t>
+            </w:r>
+            <w:r>
+              <w:t xml:space="preserve">Bar</w:t>
+            </w:r>
+            <w:r>
+              <w:t xml:space="preserve"> </w:t>
+            </w:r>
+            <w:r>
+              <w:t xml:space="preserve">No.</w:t>
+            </w:r>
+            <w:r>
+              <w:t xml:space="preserve"> </w:t>
+            </w:r>
+            <w:r>
+              <w:t xml:space="preserve">993236</w:t>
+            </w:r>
+          </w:p>
+          <w:p>
+            <w:pPr>
+              <w:spacing w:before="0" w:after="0" w:line="322" w:lineRule="exact"/>
+              <w:ind w:left="4608" w:firstLine="0"/>
+              <w:jc w:val="left"/>
+            </w:pPr>
+            <w:r>
+              <w:t xml:space="preserve">Morgan</w:t>
+            </w:r>
+            <w:r>
+              <w:t xml:space="preserve"> </w:t>
+            </w:r>
+            <w:r>
+              <w:t xml:space="preserve">McClure</w:t>
+            </w:r>
+          </w:p>
+          <w:p>
+            <w:pPr>
+              <w:spacing w:before="0" w:after="0" w:line="322" w:lineRule="exact"/>
+              <w:ind w:left="4608" w:firstLine="0"/>
+              <w:jc w:val="left"/>
+            </w:pPr>
+            <w:r>
+              <w:t xml:space="preserve">Georgia</w:t>
+            </w:r>
+            <w:r>
+              <w:t xml:space="preserve"> </w:t>
+            </w:r>
+            <w:r>
+              <w:t xml:space="preserve">Bar</w:t>
+            </w:r>
+            <w:r>
+              <w:t xml:space="preserve"> </w:t>
+            </w:r>
+            <w:r>
+              <w:t xml:space="preserve">No.</w:t>
+            </w:r>
+            <w:r>
+              <w:t xml:space="preserve"> </w:t>
+            </w:r>
+            <w:r>
+              <w:t xml:space="preserve">884372</w:t>
+            </w:r>
+          </w:p>
+          <w:p>
+            <w:pPr>
+              <w:spacing w:before="0" w:after="0" w:line="322" w:lineRule="exact"/>
+              <w:ind w:left="4608" w:firstLine="0"/>
+              <w:jc w:val="left"/>
+            </w:pPr>
+            <w:r>
+              <w:t xml:space="preserve">HALL</w:t>
+            </w:r>
+            <w:r>
+              <w:t xml:space="preserve"> </w:t>
+            </w:r>
+            <w:r>
+              <w:t xml:space="preserve">BOOTH</w:t>
+            </w:r>
+            <w:r>
+              <w:t xml:space="preserve"> </w:t>
+            </w:r>
+            <w:r>
+              <w:t xml:space="preserve">SMITH,</w:t>
+            </w:r>
+            <w:r>
+              <w:t xml:space="preserve"> </w:t>
+            </w:r>
+            <w:r>
+              <w:t xml:space="preserve">P.C.</w:t>
+            </w:r>
+          </w:p>
+          <w:p>
+            <w:pPr>
+              <w:spacing w:before="0" w:after="0" w:line="322" w:lineRule="exact"/>
+              <w:ind w:left="4608" w:firstLine="0"/>
+              <w:jc w:val="left"/>
+            </w:pPr>
+            <w:r>
+              <w:t xml:space="preserve">191</w:t>
+            </w:r>
+            <w:r>
+              <w:t xml:space="preserve"> </w:t>
+            </w:r>
+            <w:r>
+              <w:t xml:space="preserve">Peachtree</w:t>
+            </w:r>
+            <w:r>
+              <w:t xml:space="preserve"> </w:t>
+            </w:r>
+            <w:r>
+              <w:t xml:space="preserve">St.</w:t>
+            </w:r>
+            <w:r>
+              <w:t xml:space="preserve"> </w:t>
+            </w:r>
+            <w:r>
+              <w:t xml:space="preserve">NE,</w:t>
+            </w:r>
+            <w:r>
+              <w:t xml:space="preserve"> </w:t>
+            </w:r>
+            <w:r>
+              <w:t xml:space="preserve">Suite</w:t>
+            </w:r>
+            <w:r>
+              <w:t xml:space="preserve"> </w:t>
+            </w:r>
+            <w:r>
+              <w:t xml:space="preserve">2900</w:t>
+            </w:r>
+          </w:p>
+          <w:p>
+            <w:pPr>
+              <w:spacing w:before="0" w:after="0" w:line="322" w:lineRule="exact"/>
+              <w:ind w:left="4608" w:firstLine="0"/>
+              <w:jc w:val="left"/>
+            </w:pPr>
+            <w:r>
+              <w:t xml:space="preserve">404</w:t>
+              <w:noBreakHyphen/>
+              <w:t xml:space="preserve">954</w:t>
+              <w:noBreakHyphen/>
+              <w:t xml:space="preserve">5000</w:t>
+            </w:r>
+          </w:p>
+          <w:p>
+            <w:pPr>
+              <w:spacing w:before="0" w:after="0" w:line="322" w:lineRule="exact"/>
+              <w:ind w:left="4608" w:firstLine="0"/>
+              <w:jc w:val="left"/>
+            </w:pPr>
+            <w:r>
+              <w:t xml:space="preserve">aatkinson@hallboothsmith.com</w:t>
+            </w:r>
+          </w:p>
+          <w:p>
+            <w:pPr>
+              <w:spacing w:before="0" w:after="0" w:line="322" w:lineRule="exact"/>
+              <w:ind w:left="4608" w:firstLine="0"/>
+              <w:jc w:val="left"/>
+            </w:pPr>
+            <w:r>
+              <w:t xml:space="preserve">bwalker@hallboothsmith.com</w:t>
+            </w:r>
+          </w:p>
+          <w:p>
+            <w:pPr>
+              <w:spacing w:before="0" w:after="0" w:line="322" w:lineRule="exact"/>
+              <w:ind w:left="4608" w:firstLine="0"/>
+              <w:jc w:val="left"/>
+            </w:pPr>
+            <w:r>
+              <w:t xml:space="preserve">mmcclure@hallboothsmith.com</w:t>
+            </w:r>
+          </w:p>
+          <w:p>
+            <w:pPr>
+              <w:spacing w:before="0" w:after="0" w:line="322" w:lineRule="exact"/>
+              <w:ind w:left="4608" w:firstLine="0"/>
+              <w:jc w:val="left"/>
+            </w:pPr>
+            <w:r>
+              <w:rPr>
+                <w:i/>
+                <w:iCs/>
+              </w:rPr>
+              <w:t xml:space="preserve">Counsel</w:t>
+            </w:r>
+            <w:r>
+              <w:rPr>
+                <w:i/>
+                <w:iCs/>
+              </w:rPr>
+              <w:t xml:space="preserve"> </w:t>
+            </w:r>
+            <w:r>
+              <w:rPr>
+                <w:i/>
+                <w:iCs/>
+              </w:rPr>
+              <w:t xml:space="preserve">for</w:t>
+            </w:r>
+            <w:r>
+              <w:rPr>
+                <w:i/>
+                <w:iCs/>
+              </w:rPr>
+              <w:t xml:space="preserve"> </w:t>
+            </w:r>
+            <w:r>
+              <w:rPr>
+                <w:i/>
+                <w:iCs/>
+              </w:rPr>
+              <w:t xml:space="preserve">Appellee</w:t>
+            </w:r>
+          </w:p>
+        </w:tc>
+      </w:tr>
+    </w:tbl>
+    <w:p>
+      <w:pPr>
         <w:pageBreakBefore/>
+        <w:spacing w:before="0" w:after="0" w:line="1" w:lineRule="exact"/>
+      </w:pPr>
+    </w:p>
+    <w:p>
+      <w:pPr>
         <w:spacing w:before="0" w:after="320" w:line="322" w:lineRule="exact"/>
         <w:ind w:left="0" w:firstLine="0"/>
         <w:jc w:val="center"/>
@@ -2757,6 +2747,7 @@
       <w:pPr>
         <w:spacing w:before="0" w:after="0" w:line="644" w:lineRule="exact"/>
         <w:ind w:left="0" w:firstLine="720"/>
+        <w:jc w:val="left"/>
       </w:pPr>
       <w:r>
         <w:t xml:space="preserve">I</w:t>
@@ -3052,523 +3043,547 @@
     </w:p>
     <w:p>
       <w:pPr>
-        <w:keepNext/>
-        <w:keepLines/>
-        <w:spacing w:before="322" w:after="0" w:line="322" w:lineRule="exact"/>
-        <w:ind w:left="1440" w:firstLine="0"/>
-      </w:pPr>
-      <w:r>
-        <w:t xml:space="preserve">Jody</w:t>
-      </w:r>
-      <w:r>
-        <w:t xml:space="preserve"> </w:t>
-      </w:r>
-      <w:r>
-        <w:t xml:space="preserve">Peterman</w:t>
-      </w:r>
-    </w:p>
-    <w:p>
-      <w:pPr>
-        <w:keepNext/>
-        <w:keepLines/>
         <w:spacing w:before="0" w:after="0" w:line="322" w:lineRule="exact"/>
-        <w:ind w:left="1440" w:firstLine="0"/>
-      </w:pPr>
-      <w:r>
-        <w:t xml:space="preserve">Michael</w:t>
-      </w:r>
-      <w:r>
-        <w:t xml:space="preserve"> </w:t>
-      </w:r>
-      <w:r>
-        <w:t xml:space="preserve">Burke</w:t>
-      </w:r>
-    </w:p>
-    <w:p>
-      <w:pPr>
-        <w:keepNext/>
-        <w:keepLines/>
+      </w:pPr>
+    </w:p>
+    <w:tbl>
+      <w:tblPr>
+        <w:tblW w:w="9360" w:type="dxa"/>
+        <w:tblLayout w:type="fixed"/>
+        <w:tblCellMar>
+          <w:top w:w="0" w:type="dxa"/>
+          <w:left w:w="0" w:type="dxa"/>
+          <w:bottom w:w="0" w:type="dxa"/>
+          <w:right w:w="0" w:type="dxa"/>
+        </w:tblCellMar>
+        <w:tblLook w:val="0000" w:firstRow="0" w:lastRow="0" w:firstColumn="0" w:lastColumn="0" w:noHBand="0" w:noVBand="0"/>
+      </w:tblPr>
+      <w:tblGrid>
+        <w:gridCol w:w="9360"/>
+      </w:tblGrid>
+      <w:tr>
+        <w:trPr>
+          <w:cantSplit/>
+        </w:trPr>
+        <w:tc>
+          <w:tcPr>
+            <w:tcW w:w="9360" w:type="dxa"/>
+          </w:tcPr>
+          <w:p>
+            <w:pPr>
+              <w:spacing w:before="0" w:after="0" w:line="322" w:lineRule="exact"/>
+              <w:ind w:left="1440" w:firstLine="0"/>
+              <w:jc w:val="left"/>
+            </w:pPr>
+            <w:r>
+              <w:t xml:space="preserve">Jody</w:t>
+            </w:r>
+            <w:r>
+              <w:t xml:space="preserve"> </w:t>
+            </w:r>
+            <w:r>
+              <w:t xml:space="preserve">Peterman</w:t>
+            </w:r>
+          </w:p>
+          <w:p>
+            <w:pPr>
+              <w:spacing w:before="0" w:after="0" w:line="322" w:lineRule="exact"/>
+              <w:ind w:left="1440" w:firstLine="0"/>
+              <w:jc w:val="left"/>
+            </w:pPr>
+            <w:r>
+              <w:t xml:space="preserve">Michael</w:t>
+            </w:r>
+            <w:r>
+              <w:t xml:space="preserve"> </w:t>
+            </w:r>
+            <w:r>
+              <w:t xml:space="preserve">Burke</w:t>
+            </w:r>
+          </w:p>
+          <w:p>
+            <w:pPr>
+              <w:spacing w:before="0" w:after="0" w:line="322" w:lineRule="exact"/>
+              <w:ind w:left="1440" w:firstLine="0"/>
+              <w:jc w:val="left"/>
+            </w:pPr>
+            <w:r>
+              <w:t xml:space="preserve">Stephen</w:t>
+            </w:r>
+            <w:r>
+              <w:t xml:space="preserve"> </w:t>
+            </w:r>
+            <w:r>
+              <w:t xml:space="preserve">Delk</w:t>
+            </w:r>
+          </w:p>
+          <w:p>
+            <w:pPr>
+              <w:spacing w:before="0" w:after="0" w:line="322" w:lineRule="exact"/>
+              <w:ind w:left="1440" w:firstLine="0"/>
+              <w:jc w:val="left"/>
+            </w:pPr>
+            <w:r>
+              <w:t xml:space="preserve">304</w:t>
+            </w:r>
+            <w:r>
+              <w:t xml:space="preserve"> </w:t>
+            </w:r>
+            <w:r>
+              <w:t xml:space="preserve">N.</w:t>
+            </w:r>
+            <w:r>
+              <w:t xml:space="preserve"> </w:t>
+            </w:r>
+            <w:r>
+              <w:t xml:space="preserve">Ashley</w:t>
+            </w:r>
+            <w:r>
+              <w:t xml:space="preserve"> </w:t>
+            </w:r>
+            <w:r>
+              <w:t xml:space="preserve">Street</w:t>
+            </w:r>
+          </w:p>
+          <w:p>
+            <w:pPr>
+              <w:spacing w:before="0" w:after="0" w:line="322" w:lineRule="exact"/>
+              <w:ind w:left="1440" w:firstLine="0"/>
+              <w:jc w:val="left"/>
+            </w:pPr>
+            <w:r>
+              <w:t xml:space="preserve">Valdosta,</w:t>
+            </w:r>
+            <w:r>
+              <w:t xml:space="preserve"> </w:t>
+            </w:r>
+            <w:r>
+              <w:t xml:space="preserve">Georgia</w:t>
+            </w:r>
+            <w:r>
+              <w:t xml:space="preserve"> </w:t>
+            </w:r>
+            <w:r>
+              <w:t xml:space="preserve">31601</w:t>
+            </w:r>
+          </w:p>
+          <w:p>
+            <w:pPr>
+              <w:spacing w:before="0" w:after="0" w:line="322" w:lineRule="exact"/>
+              <w:ind w:left="1440" w:firstLine="0"/>
+              <w:jc w:val="left"/>
+            </w:pPr>
+            <w:r>
+              <w:t xml:space="preserve">229</w:t>
+              <w:noBreakHyphen/>
+              <w:t xml:space="preserve">247</w:t>
+              <w:noBreakHyphen/>
+              <w:t xml:space="preserve">0386</w:t>
+            </w:r>
+          </w:p>
+          <w:p>
+            <w:pPr>
+              <w:spacing w:before="0" w:after="0" w:line="322" w:lineRule="exact"/>
+              <w:ind w:left="1440" w:firstLine="0"/>
+              <w:jc w:val="left"/>
+            </w:pPr>
+            <w:r>
+              <w:t xml:space="preserve">petermanlawoffice@yahoo.com</w:t>
+            </w:r>
+          </w:p>
+          <w:p>
+            <w:pPr>
+              <w:spacing w:before="0" w:after="0" w:line="322" w:lineRule="exact"/>
+              <w:ind w:left="1440" w:firstLine="0"/>
+              <w:jc w:val="left"/>
+            </w:pPr>
+            <w:r>
+              <w:t xml:space="preserve">mburke.petermanlaw@gmail.com</w:t>
+            </w:r>
+          </w:p>
+          <w:p>
+            <w:pPr>
+              <w:spacing w:before="0" w:after="0" w:line="322" w:lineRule="exact"/>
+              <w:ind w:left="1440" w:firstLine="0"/>
+              <w:jc w:val="left"/>
+            </w:pPr>
+            <w:r>
+              <w:t xml:space="preserve">sddelk.petermanlaw@gmail.com</w:t>
+            </w:r>
+          </w:p>
+        </w:tc>
+      </w:tr>
+    </w:tbl>
+    <w:p>
+      <w:pPr>
         <w:spacing w:before="0" w:after="0" w:line="322" w:lineRule="exact"/>
-        <w:ind w:left="1440" w:firstLine="0"/>
-      </w:pPr>
-      <w:r>
-        <w:t xml:space="preserve">Stephen</w:t>
-      </w:r>
-      <w:r>
-        <w:t xml:space="preserve"> </w:t>
-      </w:r>
-      <w:r>
-        <w:t xml:space="preserve">Delk</w:t>
-      </w:r>
-    </w:p>
-    <w:p>
-      <w:pPr>
-        <w:keepNext/>
-        <w:keepLines/>
-        <w:spacing w:before="0" w:after="0" w:line="322" w:lineRule="exact"/>
-        <w:ind w:left="1440" w:firstLine="0"/>
-      </w:pPr>
-      <w:r>
-        <w:t xml:space="preserve">304</w:t>
-      </w:r>
-      <w:r>
-        <w:t xml:space="preserve"> </w:t>
-      </w:r>
-      <w:r>
-        <w:t xml:space="preserve">N.</w:t>
-      </w:r>
-      <w:r>
-        <w:t xml:space="preserve"> </w:t>
-      </w:r>
-      <w:r>
-        <w:t xml:space="preserve">Ashley</w:t>
-      </w:r>
-      <w:r>
-        <w:t xml:space="preserve"> </w:t>
-      </w:r>
-      <w:r>
-        <w:t xml:space="preserve">Street</w:t>
-      </w:r>
-    </w:p>
-    <w:p>
-      <w:pPr>
-        <w:keepNext/>
-        <w:keepLines/>
-        <w:spacing w:before="0" w:after="0" w:line="322" w:lineRule="exact"/>
-        <w:ind w:left="1440" w:firstLine="0"/>
-      </w:pPr>
-      <w:r>
-        <w:t xml:space="preserve">Valdosta,</w:t>
-      </w:r>
-      <w:r>
-        <w:t xml:space="preserve"> </w:t>
-      </w:r>
-      <w:r>
-        <w:t xml:space="preserve">Georgia</w:t>
-      </w:r>
-      <w:r>
-        <w:t xml:space="preserve"> </w:t>
-      </w:r>
-      <w:r>
-        <w:t xml:space="preserve">31601</w:t>
-      </w:r>
-    </w:p>
-    <w:p>
-      <w:pPr>
-        <w:keepNext/>
-        <w:keepLines/>
-        <w:spacing w:before="0" w:after="0" w:line="322" w:lineRule="exact"/>
-        <w:ind w:left="1440" w:firstLine="0"/>
-      </w:pPr>
-      <w:r>
-        <w:t xml:space="preserve">229</w:t>
-      </w:r>
-      <w:r>
-        <w:noBreakHyphen/>
-      </w:r>
-      <w:r>
-        <w:t xml:space="preserve">247</w:t>
-      </w:r>
-      <w:r>
-        <w:noBreakHyphen/>
-      </w:r>
-      <w:r>
-        <w:t xml:space="preserve">0386</w:t>
-      </w:r>
-    </w:p>
-    <w:p>
-      <w:pPr>
-        <w:keepNext/>
-        <w:keepLines/>
-        <w:spacing w:before="0" w:after="0" w:line="322" w:lineRule="exact"/>
-        <w:ind w:left="1440" w:firstLine="0"/>
-      </w:pPr>
-      <w:r>
-        <w:t xml:space="preserve">petermanlawoffice@yahoo.com</w:t>
-      </w:r>
-    </w:p>
-    <w:p>
-      <w:pPr>
-        <w:keepNext/>
-        <w:keepLines/>
-        <w:spacing w:before="0" w:after="0" w:line="322" w:lineRule="exact"/>
-        <w:ind w:left="1440" w:firstLine="0"/>
-      </w:pPr>
-      <w:r>
-        <w:t xml:space="preserve">mburke.petermanlaw@gmail.com</w:t>
-      </w:r>
-    </w:p>
-    <w:p>
-      <w:pPr>
-        <w:keepLines/>
-        <w:spacing w:before="0" w:after="322" w:line="322" w:lineRule="exact"/>
-        <w:ind w:left="1440" w:firstLine="0"/>
-      </w:pPr>
-      <w:r>
-        <w:t xml:space="preserve">sddelk.petermanlaw@gmail.com</w:t>
-      </w:r>
-    </w:p>
-    <w:p>
-      <w:pPr>
-        <w:keepNext/>
-        <w:keepLines/>
-        <w:spacing w:before="160" w:after="0" w:line="322" w:lineRule="exact"/>
-        <w:ind w:left="4608" w:firstLine="0"/>
-      </w:pPr>
-      <w:r>
-        <w:rPr>
-          <w:u w:val="single"/>
-        </w:rPr>
-        <w:t xml:space="preserve">/s/</w:t>
-      </w:r>
-      <w:r>
-        <w:rPr>
-          <w:u w:val="single"/>
-        </w:rPr>
-        <w:t xml:space="preserve"> </w:t>
-      </w:r>
-      <w:r>
-        <w:rPr>
-          <w:i/>
-          <w:iCs/>
-          <w:u w:val="single"/>
-        </w:rPr>
-        <w:t xml:space="preserve">Austin</w:t>
-      </w:r>
-      <w:r>
-        <w:rPr>
-          <w:i/>
-          <w:iCs/>
-          <w:u w:val="single"/>
-        </w:rPr>
-        <w:t xml:space="preserve"> </w:t>
-      </w:r>
-      <w:r>
-        <w:rPr>
-          <w:i/>
-          <w:iCs/>
-          <w:u w:val="single"/>
-        </w:rPr>
-        <w:t xml:space="preserve">Atkinson</w:t>
-      </w:r>
-    </w:p>
-    <w:p>
-      <w:pPr>
-        <w:keepNext/>
-        <w:keepLines/>
-        <w:spacing w:before="0" w:after="0" w:line="322" w:lineRule="exact"/>
-        <w:ind w:left="4608" w:firstLine="0"/>
-      </w:pPr>
-      <w:r>
-        <w:t xml:space="preserve">Austin</w:t>
-      </w:r>
-      <w:r>
-        <w:t xml:space="preserve"> </w:t>
-      </w:r>
-      <w:r>
-        <w:t xml:space="preserve">Atkinson</w:t>
-      </w:r>
-    </w:p>
-    <w:p>
-      <w:pPr>
-        <w:keepNext/>
-        <w:keepLines/>
-        <w:spacing w:before="0" w:after="0" w:line="322" w:lineRule="exact"/>
-        <w:ind w:left="4608" w:firstLine="0"/>
-      </w:pPr>
-      <w:r>
-        <w:t xml:space="preserve">Georgia</w:t>
-      </w:r>
-      <w:r>
-        <w:t xml:space="preserve"> </w:t>
-      </w:r>
-      <w:r>
-        <w:t xml:space="preserve">Bar</w:t>
-      </w:r>
-      <w:r>
-        <w:t xml:space="preserve"> </w:t>
-      </w:r>
-      <w:r>
-        <w:t xml:space="preserve">No.</w:t>
-      </w:r>
-      <w:r>
-        <w:t xml:space="preserve"> </w:t>
-      </w:r>
-      <w:r>
-        <w:t xml:space="preserve">935864</w:t>
-      </w:r>
-    </w:p>
-    <w:p>
-      <w:pPr>
-        <w:keepNext/>
-        <w:keepLines/>
-        <w:spacing w:before="160" w:after="0" w:line="322" w:lineRule="exact"/>
-        <w:ind w:left="4608" w:firstLine="0"/>
-      </w:pPr>
-      <w:r>
-        <w:t xml:space="preserve">M.</w:t>
-      </w:r>
-      <w:r>
-        <w:t xml:space="preserve"> </w:t>
-      </w:r>
-      <w:r>
-        <w:t xml:space="preserve">Blake</w:t>
-      </w:r>
-      <w:r>
-        <w:t xml:space="preserve"> </w:t>
-      </w:r>
-      <w:r>
-        <w:t xml:space="preserve">Walker</w:t>
-      </w:r>
-    </w:p>
-    <w:p>
-      <w:pPr>
-        <w:keepNext/>
-        <w:keepLines/>
-        <w:spacing w:before="0" w:after="0" w:line="322" w:lineRule="exact"/>
-        <w:ind w:left="4608" w:firstLine="0"/>
-      </w:pPr>
-      <w:r>
-        <w:t xml:space="preserve">Georgia</w:t>
-      </w:r>
-      <w:r>
-        <w:t xml:space="preserve"> </w:t>
-      </w:r>
-      <w:r>
-        <w:t xml:space="preserve">Bar</w:t>
-      </w:r>
-      <w:r>
-        <w:t xml:space="preserve"> </w:t>
-      </w:r>
-      <w:r>
-        <w:t xml:space="preserve">No.</w:t>
-      </w:r>
-      <w:r>
-        <w:t xml:space="preserve"> </w:t>
-      </w:r>
-      <w:r>
-        <w:t xml:space="preserve">993236</w:t>
-      </w:r>
-    </w:p>
-    <w:p>
-      <w:pPr>
-        <w:keepNext/>
-        <w:keepLines/>
-        <w:spacing w:before="0" w:after="0" w:line="322" w:lineRule="exact"/>
-        <w:ind w:left="4608" w:firstLine="0"/>
-      </w:pPr>
-      <w:r>
-        <w:t xml:space="preserve">Morgan</w:t>
-      </w:r>
-      <w:r>
-        <w:t xml:space="preserve"> </w:t>
-      </w:r>
-      <w:r>
-        <w:t xml:space="preserve">McClure</w:t>
-      </w:r>
-    </w:p>
-    <w:p>
-      <w:pPr>
-        <w:keepNext/>
-        <w:keepLines/>
-        <w:spacing w:before="0" w:after="0" w:line="322" w:lineRule="exact"/>
-        <w:ind w:left="4608" w:firstLine="0"/>
-      </w:pPr>
-      <w:r>
-        <w:t xml:space="preserve">Georgia</w:t>
-      </w:r>
-      <w:r>
-        <w:t xml:space="preserve"> </w:t>
-      </w:r>
-      <w:r>
-        <w:t xml:space="preserve">Bar</w:t>
-      </w:r>
-      <w:r>
-        <w:t xml:space="preserve"> </w:t>
-      </w:r>
-      <w:r>
-        <w:t xml:space="preserve">No.</w:t>
-      </w:r>
-      <w:r>
-        <w:t xml:space="preserve"> </w:t>
-      </w:r>
-      <w:r>
-        <w:t xml:space="preserve">884372</w:t>
-      </w:r>
-    </w:p>
-    <w:p>
-      <w:pPr>
-        <w:keepNext/>
-        <w:keepLines/>
-        <w:spacing w:before="0" w:after="0" w:line="322" w:lineRule="exact"/>
-        <w:ind w:left="4608" w:firstLine="0"/>
-      </w:pPr>
-      <w:r>
-        <w:t xml:space="preserve">HALL</w:t>
-      </w:r>
-      <w:r>
-        <w:t xml:space="preserve"> </w:t>
-      </w:r>
-      <w:r>
-        <w:t xml:space="preserve">BOOTH</w:t>
-      </w:r>
-      <w:r>
-        <w:t xml:space="preserve"> </w:t>
-      </w:r>
-      <w:r>
-        <w:t xml:space="preserve">SMITH,</w:t>
-      </w:r>
-      <w:r>
-        <w:t xml:space="preserve"> </w:t>
-      </w:r>
-      <w:r>
-        <w:t xml:space="preserve">P.C.</w:t>
-      </w:r>
-    </w:p>
-    <w:p>
-      <w:pPr>
-        <w:keepNext/>
-        <w:keepLines/>
-        <w:spacing w:before="0" w:after="0" w:line="322" w:lineRule="exact"/>
-        <w:ind w:left="4608" w:firstLine="0"/>
-      </w:pPr>
-      <w:r>
-        <w:t xml:space="preserve">191</w:t>
-      </w:r>
-      <w:r>
-        <w:t xml:space="preserve"> </w:t>
-      </w:r>
-      <w:r>
-        <w:t xml:space="preserve">Peachtree</w:t>
-      </w:r>
-      <w:r>
-        <w:t xml:space="preserve"> </w:t>
-      </w:r>
-      <w:r>
-        <w:t xml:space="preserve">St.</w:t>
-      </w:r>
-      <w:r>
-        <w:t xml:space="preserve"> </w:t>
-      </w:r>
-      <w:r>
-        <w:t xml:space="preserve">NE,</w:t>
-      </w:r>
-      <w:r>
-        <w:t xml:space="preserve"> </w:t>
-      </w:r>
-      <w:r>
-        <w:t xml:space="preserve">Suite</w:t>
-      </w:r>
-      <w:r>
-        <w:t xml:space="preserve"> </w:t>
-      </w:r>
-      <w:r>
-        <w:t xml:space="preserve">2900</w:t>
-      </w:r>
-    </w:p>
-    <w:p>
-      <w:pPr>
-        <w:keepNext/>
-        <w:keepLines/>
-        <w:spacing w:before="0" w:after="0" w:line="322" w:lineRule="exact"/>
-        <w:ind w:left="4608" w:firstLine="0"/>
-      </w:pPr>
-      <w:r>
-        <w:t xml:space="preserve">404</w:t>
-      </w:r>
-      <w:r>
-        <w:noBreakHyphen/>
-      </w:r>
-      <w:r>
-        <w:t xml:space="preserve">954</w:t>
-      </w:r>
-      <w:r>
-        <w:noBreakHyphen/>
-      </w:r>
-      <w:r>
-        <w:t xml:space="preserve">5000</w:t>
-      </w:r>
-    </w:p>
-    <w:p>
-      <w:pPr>
-        <w:keepNext/>
-        <w:keepLines/>
-        <w:spacing w:before="0" w:after="0" w:line="322" w:lineRule="exact"/>
-        <w:ind w:left="4608" w:firstLine="0"/>
-      </w:pPr>
-      <w:r>
-        <w:t xml:space="preserve">aatkinson@hallboothsmith.com</w:t>
-      </w:r>
-    </w:p>
-    <w:p>
-      <w:pPr>
-        <w:keepNext/>
-        <w:keepLines/>
-        <w:spacing w:before="0" w:after="0" w:line="322" w:lineRule="exact"/>
-        <w:ind w:left="4608" w:firstLine="0"/>
-      </w:pPr>
-      <w:r>
-        <w:t xml:space="preserve">bwalker@hallboothsmith.com</w:t>
-      </w:r>
-    </w:p>
-    <w:p>
-      <w:pPr>
-        <w:keepNext/>
-        <w:keepLines/>
-        <w:spacing w:before="0" w:after="0" w:line="322" w:lineRule="exact"/>
-        <w:ind w:left="4608" w:firstLine="0"/>
-      </w:pPr>
-      <w:r>
-        <w:t xml:space="preserve">mmcclure@hallboothsmith.com</w:t>
-      </w:r>
-    </w:p>
-    <w:p>
-      <w:pPr>
-        <w:keepLines/>
-        <w:spacing w:before="0" w:after="0" w:line="322" w:lineRule="exact"/>
-        <w:ind w:left="4608" w:firstLine="0"/>
-      </w:pPr>
-      <w:r>
-        <w:rPr>
-          <w:i/>
-          <w:iCs/>
-        </w:rPr>
-        <w:t xml:space="preserve">Counsel</w:t>
-      </w:r>
-      <w:r>
-        <w:rPr>
-          <w:i/>
-          <w:iCs/>
-        </w:rPr>
-        <w:t xml:space="preserve"> </w:t>
-      </w:r>
-      <w:r>
-        <w:rPr>
-          <w:i/>
-          <w:iCs/>
-        </w:rPr>
-        <w:t xml:space="preserve">for</w:t>
-      </w:r>
-      <w:r>
-        <w:rPr>
-          <w:i/>
-          <w:iCs/>
-        </w:rPr>
-        <w:t xml:space="preserve"> </w:t>
-      </w:r>
-      <w:r>
-        <w:rPr>
-          <w:i/>
-          <w:iCs/>
-        </w:rPr>
-        <w:t xml:space="preserve">Appellee</w:t>
-      </w:r>
-    </w:p>
+      </w:pPr>
+    </w:p>
+    <w:tbl>
+      <w:tblPr>
+        <w:tblW w:w="9360" w:type="dxa"/>
+        <w:tblLayout w:type="fixed"/>
+        <w:tblCellMar>
+          <w:top w:w="0" w:type="dxa"/>
+          <w:left w:w="0" w:type="dxa"/>
+          <w:bottom w:w="0" w:type="dxa"/>
+          <w:right w:w="0" w:type="dxa"/>
+        </w:tblCellMar>
+        <w:tblLook w:val="0000" w:firstRow="0" w:lastRow="0" w:firstColumn="0" w:lastColumn="0" w:noHBand="0" w:noVBand="0"/>
+      </w:tblPr>
+      <w:tblGrid>
+        <w:gridCol w:w="9360"/>
+      </w:tblGrid>
+      <w:tr>
+        <w:trPr>
+          <w:cantSplit/>
+        </w:trPr>
+        <w:tc>
+          <w:tcPr>
+            <w:tcW w:w="9360" w:type="dxa"/>
+          </w:tcPr>
+          <w:p>
+            <w:pPr>
+              <w:spacing w:before="240" w:after="0" w:line="322" w:lineRule="exact"/>
+              <w:ind w:left="4608" w:firstLine="0"/>
+              <w:jc w:val="left"/>
+            </w:pPr>
+            <w:r>
+              <w:rPr>
+                <w:u w:val="single"/>
+              </w:rPr>
+              <w:t xml:space="preserve">/s/</w:t>
+            </w:r>
+            <w:r>
+              <w:rPr>
+                <w:u w:val="single"/>
+              </w:rPr>
+              <w:t xml:space="preserve"> </w:t>
+            </w:r>
+            <w:r>
+              <w:rPr>
+                <w:i/>
+                <w:iCs/>
+                <w:u w:val="single"/>
+              </w:rPr>
+              <w:t xml:space="preserve">Austin</w:t>
+            </w:r>
+            <w:r>
+              <w:rPr>
+                <w:i/>
+                <w:iCs/>
+                <w:u w:val="single"/>
+              </w:rPr>
+              <w:t xml:space="preserve"> </w:t>
+            </w:r>
+            <w:r>
+              <w:rPr>
+                <w:i/>
+                <w:iCs/>
+                <w:u w:val="single"/>
+              </w:rPr>
+              <w:t xml:space="preserve">Atkinson</w:t>
+            </w:r>
+          </w:p>
+          <w:p>
+            <w:pPr>
+              <w:spacing w:before="0" w:after="0" w:line="322" w:lineRule="exact"/>
+              <w:ind w:left="4608" w:firstLine="0"/>
+              <w:jc w:val="left"/>
+            </w:pPr>
+            <w:r>
+              <w:t xml:space="preserve">Austin</w:t>
+            </w:r>
+            <w:r>
+              <w:t xml:space="preserve"> </w:t>
+            </w:r>
+            <w:r>
+              <w:t xml:space="preserve">Atkinson</w:t>
+            </w:r>
+          </w:p>
+          <w:p>
+            <w:pPr>
+              <w:spacing w:before="0" w:after="0" w:line="322" w:lineRule="exact"/>
+              <w:ind w:left="4608" w:firstLine="0"/>
+              <w:jc w:val="left"/>
+            </w:pPr>
+            <w:r>
+              <w:t xml:space="preserve">Georgia</w:t>
+            </w:r>
+            <w:r>
+              <w:t xml:space="preserve"> </w:t>
+            </w:r>
+            <w:r>
+              <w:t xml:space="preserve">Bar</w:t>
+            </w:r>
+            <w:r>
+              <w:t xml:space="preserve"> </w:t>
+            </w:r>
+            <w:r>
+              <w:t xml:space="preserve">No.</w:t>
+            </w:r>
+            <w:r>
+              <w:t xml:space="preserve"> </w:t>
+            </w:r>
+            <w:r>
+              <w:t xml:space="preserve">935864</w:t>
+            </w:r>
+          </w:p>
+          <w:p>
+            <w:pPr>
+              <w:spacing w:before="160" w:after="0" w:line="322" w:lineRule="exact"/>
+              <w:ind w:left="4608" w:firstLine="0"/>
+              <w:jc w:val="left"/>
+            </w:pPr>
+            <w:r>
+              <w:t xml:space="preserve">M.</w:t>
+            </w:r>
+            <w:r>
+              <w:t xml:space="preserve"> </w:t>
+            </w:r>
+            <w:r>
+              <w:t xml:space="preserve">Blake</w:t>
+            </w:r>
+            <w:r>
+              <w:t xml:space="preserve"> </w:t>
+            </w:r>
+            <w:r>
+              <w:t xml:space="preserve">Walker</w:t>
+            </w:r>
+          </w:p>
+          <w:p>
+            <w:pPr>
+              <w:spacing w:before="0" w:after="0" w:line="322" w:lineRule="exact"/>
+              <w:ind w:left="4608" w:firstLine="0"/>
+              <w:jc w:val="left"/>
+            </w:pPr>
+            <w:r>
+              <w:t xml:space="preserve">Georgia</w:t>
+            </w:r>
+            <w:r>
+              <w:t xml:space="preserve"> </w:t>
+            </w:r>
+            <w:r>
+              <w:t xml:space="preserve">Bar</w:t>
+            </w:r>
+            <w:r>
+              <w:t xml:space="preserve"> </w:t>
+            </w:r>
+            <w:r>
+              <w:t xml:space="preserve">No.</w:t>
+            </w:r>
+            <w:r>
+              <w:t xml:space="preserve"> </w:t>
+            </w:r>
+            <w:r>
+              <w:t xml:space="preserve">993236</w:t>
+            </w:r>
+          </w:p>
+          <w:p>
+            <w:pPr>
+              <w:spacing w:before="0" w:after="0" w:line="322" w:lineRule="exact"/>
+              <w:ind w:left="4608" w:firstLine="0"/>
+              <w:jc w:val="left"/>
+            </w:pPr>
+            <w:r>
+              <w:t xml:space="preserve">Morgan</w:t>
+            </w:r>
+            <w:r>
+              <w:t xml:space="preserve"> </w:t>
+            </w:r>
+            <w:r>
+              <w:t xml:space="preserve">McClure</w:t>
+            </w:r>
+          </w:p>
+          <w:p>
+            <w:pPr>
+              <w:spacing w:before="0" w:after="0" w:line="322" w:lineRule="exact"/>
+              <w:ind w:left="4608" w:firstLine="0"/>
+              <w:jc w:val="left"/>
+            </w:pPr>
+            <w:r>
+              <w:t xml:space="preserve">Georgia</w:t>
+            </w:r>
+            <w:r>
+              <w:t xml:space="preserve"> </w:t>
+            </w:r>
+            <w:r>
+              <w:t xml:space="preserve">Bar</w:t>
+            </w:r>
+            <w:r>
+              <w:t xml:space="preserve"> </w:t>
+            </w:r>
+            <w:r>
+              <w:t xml:space="preserve">No.</w:t>
+            </w:r>
+            <w:r>
+              <w:t xml:space="preserve"> </w:t>
+            </w:r>
+            <w:r>
+              <w:t xml:space="preserve">884372</w:t>
+            </w:r>
+          </w:p>
+          <w:p>
+            <w:pPr>
+              <w:spacing w:before="0" w:after="0" w:line="322" w:lineRule="exact"/>
+              <w:ind w:left="4608" w:firstLine="0"/>
+              <w:jc w:val="left"/>
+            </w:pPr>
+            <w:r>
+              <w:t xml:space="preserve">HALL</w:t>
+            </w:r>
+            <w:r>
+              <w:t xml:space="preserve"> </w:t>
+            </w:r>
+            <w:r>
+              <w:t xml:space="preserve">BOOTH</w:t>
+            </w:r>
+            <w:r>
+              <w:t xml:space="preserve"> </w:t>
+            </w:r>
+            <w:r>
+              <w:t xml:space="preserve">SMITH,</w:t>
+            </w:r>
+            <w:r>
+              <w:t xml:space="preserve"> </w:t>
+            </w:r>
+            <w:r>
+              <w:t xml:space="preserve">P.C.</w:t>
+            </w:r>
+          </w:p>
+          <w:p>
+            <w:pPr>
+              <w:spacing w:before="0" w:after="0" w:line="322" w:lineRule="exact"/>
+              <w:ind w:left="4608" w:firstLine="0"/>
+              <w:jc w:val="left"/>
+            </w:pPr>
+            <w:r>
+              <w:t xml:space="preserve">191</w:t>
+            </w:r>
+            <w:r>
+              <w:t xml:space="preserve"> </w:t>
+            </w:r>
+            <w:r>
+              <w:t xml:space="preserve">Peachtree</w:t>
+            </w:r>
+            <w:r>
+              <w:t xml:space="preserve"> </w:t>
+            </w:r>
+            <w:r>
+              <w:t xml:space="preserve">St.</w:t>
+            </w:r>
+            <w:r>
+              <w:t xml:space="preserve"> </w:t>
+            </w:r>
+            <w:r>
+              <w:t xml:space="preserve">NE,</w:t>
+            </w:r>
+            <w:r>
+              <w:t xml:space="preserve"> </w:t>
+            </w:r>
+            <w:r>
+              <w:t xml:space="preserve">Suite</w:t>
+            </w:r>
+            <w:r>
+              <w:t xml:space="preserve"> </w:t>
+            </w:r>
+            <w:r>
+              <w:t xml:space="preserve">2900</w:t>
+            </w:r>
+          </w:p>
+          <w:p>
+            <w:pPr>
+              <w:spacing w:before="0" w:after="0" w:line="322" w:lineRule="exact"/>
+              <w:ind w:left="4608" w:firstLine="0"/>
+              <w:jc w:val="left"/>
+            </w:pPr>
+            <w:r>
+              <w:t xml:space="preserve">404</w:t>
+              <w:noBreakHyphen/>
+              <w:t xml:space="preserve">954</w:t>
+              <w:noBreakHyphen/>
+              <w:t xml:space="preserve">5000</w:t>
+            </w:r>
+          </w:p>
+          <w:p>
+            <w:pPr>
+              <w:spacing w:before="0" w:after="0" w:line="322" w:lineRule="exact"/>
+              <w:ind w:left="4608" w:firstLine="0"/>
+              <w:jc w:val="left"/>
+            </w:pPr>
+            <w:r>
+              <w:t xml:space="preserve">aatkinson@hallboothsmith.com</w:t>
+            </w:r>
+          </w:p>
+          <w:p>
+            <w:pPr>
+              <w:spacing w:before="0" w:after="0" w:line="322" w:lineRule="exact"/>
+              <w:ind w:left="4608" w:firstLine="0"/>
+              <w:jc w:val="left"/>
+            </w:pPr>
+            <w:r>
+              <w:t xml:space="preserve">bwalker@hallboothsmith.com</w:t>
+            </w:r>
+          </w:p>
+          <w:p>
+            <w:pPr>
+              <w:spacing w:before="0" w:after="0" w:line="322" w:lineRule="exact"/>
+              <w:ind w:left="4608" w:firstLine="0"/>
+              <w:jc w:val="left"/>
+            </w:pPr>
+            <w:r>
+              <w:t xml:space="preserve">mmcclure@hallboothsmith.com</w:t>
+            </w:r>
+          </w:p>
+          <w:p>
+            <w:pPr>
+              <w:spacing w:before="0" w:after="0" w:line="322" w:lineRule="exact"/>
+              <w:ind w:left="4608" w:firstLine="0"/>
+              <w:jc w:val="left"/>
+            </w:pPr>
+            <w:r>
+              <w:rPr>
+                <w:i/>
+                <w:iCs/>
+              </w:rPr>
+              <w:t xml:space="preserve">Counsel</w:t>
+            </w:r>
+            <w:r>
+              <w:rPr>
+                <w:i/>
+                <w:iCs/>
+              </w:rPr>
+              <w:t xml:space="preserve"> </w:t>
+            </w:r>
+            <w:r>
+              <w:rPr>
+                <w:i/>
+                <w:iCs/>
+              </w:rPr>
+              <w:t xml:space="preserve">for</w:t>
+            </w:r>
+            <w:r>
+              <w:rPr>
+                <w:i/>
+                <w:iCs/>
+              </w:rPr>
+              <w:t xml:space="preserve"> </w:t>
+            </w:r>
+            <w:r>
+              <w:rPr>
+                <w:i/>
+                <w:iCs/>
+              </w:rPr>
+              <w:t xml:space="preserve">Appellee</w:t>
+            </w:r>
+          </w:p>
+        </w:tc>
+      </w:tr>
+    </w:tbl>
     <w:sectPr>
-      <w:footerReference w:type="default" r:id="rIdGaFtr"/>
+      <w:footerReference w:type="default" r:id="rIdXdPage"/>
       <w:pgSz w:w="12240" w:h="15840"/>
-      <w:pgMar w:top="1440" w:right="1440" w:bottom="1440" w:left="1440" w:header="720" w:footer="720" w:gutter="0"/>
-      <w:pgNumType w:fmt="decimal" w:start="1"/>
+      <w:pgMar w:top="1440" w:right="1440" w:bottom="1440" w:left="1440" w:header="720" w:footer="686" w:gutter="0"/>
     </w:sectPr>
   </w:body>
 </w:document>
@@ -3582,6 +3597,7 @@
 <w:ftr xmlns:w="http://schemas.openxmlformats.org/wordprocessingml/2006/main" xmlns:r="http://schemas.openxmlformats.org/officeDocument/2006/relationships">
   <w:p>
     <w:pPr>
+      <w:spacing w:before="0" w:after="0" w:line="322" w:lineRule="exact"/>
       <w:jc w:val="center"/>
     </w:pPr>
     <w:r>
@@ -3737,7 +3753,6 @@
   <w:p>
     <w:pPr>
       <w:spacing w:before="0" w:after="0" w:line="322" w:lineRule="exact"/>
-      <w:ind w:firstLine="0"/>
       <w:jc w:val="center"/>
     </w:pPr>
     <w:r>
@@ -3755,6 +3770,17 @@
     <w:r>
       <w:fldChar w:fldCharType="end"/>
     </w:r>
+  </w:p>
+</w:ftr>
+</file>
+
+<file path=word/ftr-own2.xml><?xml version="1.0" encoding="utf-8"?>
+<w:ftr xmlns:w="http://schemas.openxmlformats.org/wordprocessingml/2006/main" xmlns:r="http://schemas.openxmlformats.org/officeDocument/2006/relationships">
+  <w:p>
+    <w:pPr>
+      <w:spacing w:before="0" w:after="0" w:line="322" w:lineRule="exact"/>
+      <w:jc w:val="center"/>
+    </w:pPr>
   </w:p>
 </w:ftr>
 </file>
@@ -4405,7 +4431,7 @@
     <w:unhideWhenUsed/>
     <w:qFormat/>
     <w:pPr>
-      <w:spacing w:before="322" w:after="322" w:line="322" w:lineRule="exact"/>
+      <w:spacing w:before="280" w:after="280" w:line="322" w:lineRule="exact"/>
       <w:ind w:firstLine="0" w:left="720" w:right="720"/>
     </w:pPr>
   </w:style>
@@ -4417,7 +4443,6 @@
     <w:unhideWhenUsed/>
     <w:qFormat/>
     <w:pPr>
-      <w:keepLines/>
       <w:spacing w:before="0" w:after="160" w:line="322" w:lineRule="exact"/>
     </w:pPr>
     <w:rPr>
@@ -4433,7 +4458,7 @@
     <w:unhideWhenUsed/>
     <w:qFormat/>
     <w:pPr>
-      <w:spacing w:before="322" w:after="322"/>
+      <w:spacing w:before="280" w:after="280"/>
       <w:ind w:firstLine="0" w:left="720" w:right="720"/>
     </w:pPr>
   </w:style>
@@ -4562,6 +4587,123 @@
       <w:bCs w:val="0"/>
       <w:color w:val="365F91" w:themeColor="accent1" w:themeShade="BF"/>
     </w:rPr>
+  </w:style>
+  <w:style w:type="paragraph" w:customStyle="1" w:styleId="BodyTextNote">
+    <w:name w:val="Body Text Note"/>
+    <w:basedOn w:val="BodyText"/>
+    <w:qFormat/>
+    <w:pPr>
+      <w:widowControl w:val="0"/>
+    </w:pPr>
+  </w:style>
+  <w:style w:type="paragraph" w:customStyle="1" w:styleId="XdQuote">
+    <w:name w:val="Xd Quote"/>
+    <w:basedOn w:val="Normal"/>
+    <w:qFormat/>
+    <w:pPr>
+      <w:spacing w:before="322" w:after="322" w:line="322" w:lineRule="exact"/>
+      <w:ind w:left="720" w:right="720" w:firstLine="0"/>
+    </w:pPr>
+  </w:style>
+  <w:style w:type="paragraph" w:customStyle="1" w:styleId="XdQuoteFirst">
+    <w:name w:val="Xd Quote First"/>
+    <w:basedOn w:val="Normal"/>
+    <w:qFormat/>
+    <w:pPr>
+      <w:spacing w:before="322" w:after="322" w:line="322" w:lineRule="exact"/>
+      <w:ind w:left="720" w:right="720" w:firstLine="0"/>
+    </w:pPr>
+  </w:style>
+  <w:style w:type="paragraph" w:customStyle="1" w:styleId="XdQuoteLast">
+    <w:name w:val="Xd Quote Last"/>
+    <w:basedOn w:val="Normal"/>
+    <w:qFormat/>
+    <w:pPr>
+      <w:spacing w:before="322" w:after="322" w:line="322" w:lineRule="exact"/>
+      <w:ind w:left="720" w:right="720" w:firstLine="0"/>
+    </w:pPr>
+  </w:style>
+  <w:style w:type="paragraph" w:customStyle="1" w:styleId="XdQuoteOnly">
+    <w:name w:val="Xd Quote Only"/>
+    <w:basedOn w:val="Normal"/>
+    <w:qFormat/>
+    <w:pPr>
+      <w:spacing w:before="322" w:after="322" w:line="322" w:lineRule="exact"/>
+      <w:ind w:left="720" w:right="720" w:firstLine="0"/>
+    </w:pPr>
+  </w:style>
+  <w:style w:type="paragraph" w:customStyle="1" w:styleId="XdTail">
+    <w:name w:val="Xd Tail"/>
+    <w:basedOn w:val="Normal"/>
+    <w:qFormat/>
+    <w:pPr>
+      <w:spacing w:before="0" w:after="0" w:line="322" w:lineRule="exact"/>
+      <w:ind w:firstLine="0"/>
+    </w:pPr>
+  </w:style>
+  <w:style w:type="paragraph" w:customStyle="1" w:styleId="XdList1">
+    <w:name w:val="XdList 1"/>
+    <w:basedOn w:val="Normal"/>
+    <w:qFormat/>
+    <w:pPr>
+      <w:spacing w:before="0" w:after="0" w:line="644" w:lineRule="exact"/>
+      <w:ind w:left="720" w:hanging="720"/>
+    </w:pPr>
+  </w:style>
+  <w:style w:type="paragraph" w:customStyle="1" w:styleId="XdList2">
+    <w:name w:val="XdList 2"/>
+    <w:basedOn w:val="Normal"/>
+    <w:qFormat/>
+    <w:pPr>
+      <w:spacing w:before="0" w:after="0" w:line="644" w:lineRule="exact"/>
+      <w:ind w:left="1440" w:hanging="720"/>
+    </w:pPr>
+  </w:style>
+  <w:style w:type="paragraph" w:customStyle="1" w:styleId="XdList3">
+    <w:name w:val="XdList 3"/>
+    <w:basedOn w:val="Normal"/>
+    <w:qFormat/>
+    <w:pPr>
+      <w:spacing w:before="0" w:after="0" w:line="644" w:lineRule="exact"/>
+      <w:ind w:left="2160" w:hanging="720"/>
+    </w:pPr>
+  </w:style>
+  <w:style w:type="paragraph" w:customStyle="1" w:styleId="XdTailList1">
+    <w:name w:val="XdTailList 1"/>
+    <w:basedOn w:val="Normal"/>
+    <w:qFormat/>
+    <w:pPr>
+      <w:spacing w:before="0" w:after="0" w:line="322" w:lineRule="exact"/>
+      <w:ind w:left="720" w:hanging="720"/>
+    </w:pPr>
+  </w:style>
+  <w:style w:type="paragraph" w:customStyle="1" w:styleId="XdTailList2">
+    <w:name w:val="XdTailList 2"/>
+    <w:basedOn w:val="Normal"/>
+    <w:qFormat/>
+    <w:pPr>
+      <w:spacing w:before="0" w:after="0" w:line="322" w:lineRule="exact"/>
+      <w:ind w:left="1440" w:hanging="720"/>
+    </w:pPr>
+  </w:style>
+  <w:style w:type="paragraph" w:customStyle="1" w:styleId="XdTailList3">
+    <w:name w:val="XdTailList 3"/>
+    <w:basedOn w:val="Normal"/>
+    <w:qFormat/>
+    <w:pPr>
+      <w:spacing w:before="0" w:after="0" w:line="322" w:lineRule="exact"/>
+      <w:ind w:left="2160" w:hanging="720"/>
+    </w:pPr>
+  </w:style>
+  <w:style w:type="paragraph" w:customStyle="1" w:styleId="XdQuoteFirst">
+    <w:name w:val="XdQuoteFirst"/>
+    <w:basedOn w:val="BodyText"/>
+    <w:qFormat/>
+  </w:style>
+  <w:style w:type="paragraph" w:customStyle="1" w:styleId="XdQuoteLast">
+    <w:name w:val="XdQuoteLast"/>
+    <w:basedOn w:val="BodyText"/>
+    <w:qFormat/>
   </w:style>
   <w:style w:type="paragraph" w:customStyle="1" w:styleId="SourceCode">
     <w:name w:val="Source Code"/>

</xml_diff>